<commit_message>
docs: restore efficiency Tables 3A and 3B and combine current-GPU report
</commit_message>
<xml_diff>
--- a/汇报/下次汇报草稿_基线更新与ATB分析/基线更新与ATB效率分析_讲稿草稿.docx
+++ b/汇报/下次汇报草稿_基线更新与ATB分析/基线更新与ATB效率分析_讲稿草稿.docx
@@ -12,7 +12,7 @@
           <w:b/>
           <w:sz w:val="40"/>
         </w:rPr>
-        <w:t>下次汇报草稿｜视频虚化：基线补充与Any-to-Bokeh效率分析（汇报日期待定；数据截至2026-09-30）</w:t>
+        <w:t>下次汇报草稿｜视频虚化：基线补充与Any-to-Bokeh效率分析（汇报日期待定；数据截至2026-10-01）</w:t>
       </w:r>
     </w:p>
     <w:p>
@@ -36,7 +36,7 @@
           <w:rFonts w:ascii="微软雅黑" w:hAnsi="微软雅黑"/>
           <w:sz w:val="24"/>
         </w:rPr>
-        <w:t>Any-to-Bokeh仍是核心视频基线，它按视频组处理RGB、几何和对焦条件，能够利用前后帧信息。当前约0.50464秒/输出帧、38.47 GiB设备采样峰值，是后续需要解释和改善的基线成本，而不是已经实现的优化收益。</w:t>
+        <w:t>Any-to-Bokeh仍是核心视频基线。4090 D上模型段约0.803312秒/输出帧、42.14 GiB设备采样峰值；旧RTX PRO6000上为0.50464秒/输出帧、38.47 GiB。两卡结果分别标注，不能将差异说成方法优化收益。</w:t>
       </w:r>
     </w:p>
     <w:p>
@@ -282,48 +282,53 @@
           <w:b/>
           <w:sz w:val="40"/>
         </w:rPr>
-        <w:t>05  模型计算成本</w:t>
-      </w:r>
-    </w:p>
-    <w:p>
-      <w:pPr>
-        <w:spacing w:line="324" w:lineRule="auto" w:after="200"/>
-      </w:pPr>
-      <w:r>
-        <w:rPr>
-          <w:rFonts w:ascii="微软雅黑" w:hAnsi="微软雅黑"/>
-          <w:sz w:val="24"/>
-        </w:rPr>
-        <w:t>Table 3比较当前冻结生成器或模型路径的成本。同一块RTX PRO6000 Blackwell GPU，固定四个输入，各预热一次、正式重复五次。时间按实际输出帧归一，模型加载、输入读取和外围前后处理不计；显存是设备占用采样峰值，完整GFLOPs由于算子覆盖不足未列数值。</w:t>
-      </w:r>
-    </w:p>
-    <w:p>
-      <w:pPr>
-        <w:spacing w:line="324" w:lineRule="auto" w:after="200"/>
-      </w:pPr>
-      <w:r>
-        <w:rPr>
-          <w:rFonts w:ascii="微软雅黑" w:hAnsi="微软雅黑"/>
-          <w:sz w:val="24"/>
-        </w:rPr>
-        <w:t>Any-to-Bokeh按真实25帧视频路径测量，再除以输出帧数；0.50464秒不是单帧在线延迟。MagicBokeh的一张1024×576图像实际需要六个512×512图块，它的1.20890秒包含六次生成器forward与GPU重叠拼接，而不是单图块的延迟。</w:t>
-      </w:r>
-    </w:p>
-    <w:p>
-      <w:pPr>
-        <w:spacing w:line="324" w:lineRule="auto" w:after="200"/>
-      </w:pPr>
-      <w:r>
-        <w:rPr>
-          <w:rFonts w:ascii="微软雅黑" w:hAnsi="微软雅黑"/>
-          <w:sz w:val="24"/>
-        </w:rPr>
-        <w:t>MagicBokeh B实际调用的生成器参数约1398.545M，设备采样峰值约5.30 GiB，Torch allocated峰值约3.89 GiB。这里不计DAdepth估深、GT目标辅助选点、条件构造和CPU PIL/AdaIN颜色处理。相对于ATB，当前生成器路径显存更低，但全帧单位输出时间更长；单步标签不能直接说明它更快。这不是完整RGB到虚化的端到端成本。</w:t>
+        <w:t>05  模型与端到端效率：Table 3A / 3B合并展示</w:t>
+      </w:r>
+    </w:p>
+    <w:p>
+      <w:pPr>
+        <w:spacing w:line="324" w:lineRule="auto" w:after="200"/>
+      </w:pPr>
+      <w:r>
+        <w:rPr>
+          <w:rFonts w:ascii="微软雅黑" w:hAnsi="微软雅黑"/>
+          <w:sz w:val="24"/>
+        </w:rPr>
+        <w:t>Table 3A比较模型段成本。当前页为2026-10-01在4090 D上的六种GPU方法复测：固定四个输入、各预热一次和正式五次。参数量复用，完整GFLOPs继续N/A；模型加载、读取与外围前后处理不计。旧RTX PRO6000结果单独保留，不能与新卡混算方法加速比。</w:t>
+      </w:r>
+    </w:p>
+    <w:p>
+      <w:pPr>
+        <w:spacing w:line="324" w:lineRule="auto" w:after="200"/>
+      </w:pPr>
+      <w:r>
+        <w:rPr>
+          <w:rFonts w:ascii="微软雅黑" w:hAnsi="微软雅黑"/>
+          <w:sz w:val="24"/>
+        </w:rPr>
+        <w:t>Any-to-Bokeh按真实25帧路径测量，新卡模型段约20.083秒，再除25得到0.803312秒/输出帧。这不是独立单帧在线延迟。MagicBokeh一张1024×576输出由六个512×512图块组成，新卡模型时间约1.269188秒，包含生成器及GPU拼接。</w:t>
+      </w:r>
+    </w:p>
+    <w:p>
+      <w:pPr>
+        <w:spacing w:line="324" w:lineRule="auto" w:after="200"/>
+      </w:pPr>
+      <w:r>
+        <w:rPr>
+          <w:rFonts w:ascii="微软雅黑" w:hAnsi="微软雅黑"/>
+          <w:sz w:val="24"/>
+        </w:rPr>
+        <w:t>MagicBokeh B实际调用的生成器参数约1398.545M，设备采样峰值约5.13 GiB，Torch allocated峰值约3.89 GiB。这里不计DAdepth估深、GT目标辅助选点、条件构造和CPU PIL/AdaIN颜色处理。相对于ATB，当前生成器路径显存更低，但全帧单位输出时间更长；单步标签不能直接说明它更快。这不是完整RGB到虚化的端到端成本。</w:t>
       </w:r>
     </w:p>
     <w:p>
       <w:r>
         <w:br w:type="page"/>
+      </w:r>
+    </w:p>
+    <w:p>
+      <w:r>
+        <w:t>同一页合并展示3A和3B，并统一使用4090 D。3A三列已填新卡实测：模型时间、参数量和采样显存；3B的25帧E2E、FPS及对应内存目前全部待测。完整E2E从读取给定输入到25张CPU输出，包含适配和必要方法处理，排除加载、外部geometry生成和写盘编码。不能把旧卡数字换成新卡标签，也不能用模型时间乘25当作E2E。旧卡3B仍作为正式历史硬件版本保存在协议和记录中，本页不混填。</w:t>
       </w:r>
     </w:p>
     <w:p>
@@ -336,43 +341,43 @@
           <w:b/>
           <w:sz w:val="40"/>
         </w:rPr>
-        <w:t>06  ATB的主要成本集中在VAE</w:t>
-      </w:r>
-    </w:p>
-    <w:p>
-      <w:pPr>
-        <w:spacing w:line="324" w:lineRule="auto" w:after="200"/>
-      </w:pPr>
-      <w:r>
-        <w:rPr>
-          <w:rFonts w:ascii="微软雅黑" w:hAnsi="微软雅黑"/>
-          <w:sz w:val="24"/>
-        </w:rPr>
-        <w:t>首轮profile沿用四段固定输入，每段25帧，预热一次、正式重复两次，不改权重和精度。分阶段同步是为了归因，因此这些阶段耗时不能替换Table 3的正式测速结果。每段约12.626秒模型段中，RGB VAE编码约2.739秒，CoC VAE编码约2.516秒，重叠拼接与时序VAE解码约4.975秒，三项合计约81%；UNet约2.258秒。</w:t>
-      </w:r>
-    </w:p>
-    <w:p>
-      <w:pPr>
-        <w:spacing w:line="324" w:lineRule="auto" w:after="200"/>
-      </w:pPr>
-      <w:r>
-        <w:rPr>
-          <w:rFonts w:ascii="微软雅黑" w:hAnsi="微软雅黑"/>
-          <w:sz w:val="24"/>
-        </w:rPr>
-        <w:t>RGB和CoC编码阶段的Torch allocated峰值都约34.29 GiB；重叠拼接与解码阶段约29.65 GiB，UNet约14.39 GiB。这些是含常驻权重和缓存的绝对峰值，不能相加，也不能与Table 3约38.47 GiB的设备占用采样值混为同一口径。持续RGB特征缓存约6.47 GiB，其中最高分辨率一级占4.5 GiB。</w:t>
-      </w:r>
-    </w:p>
-    <w:p>
-      <w:pPr>
-        <w:spacing w:line="324" w:lineRule="auto" w:after="200"/>
-      </w:pPr>
-      <w:r>
-        <w:rPr>
-          <w:rFonts w:ascii="微软雅黑" w:hAnsi="微软雅黑"/>
-          <w:sz w:val="24"/>
-        </w:rPr>
-        <w:t>每25个最终输出帧，RGB和CoC分别处理48个编码帧槽，解码处理32个帧槽，包含窗口重叠和padding。但是重复数量不等于可以无损删掉的计算，因为还涉及随机采样、缓存索引和时序解码上下文。目前只定位了成本来源，没有验证任何优化已经提速、降显存或保持质量。历史25帧端到端表继续保存在仓库，当前不再占正式主表。</w:t>
+        <w:t>06  ATB的主要成本集中在VAE（旧RTX PRO6000模块分析）</w:t>
+      </w:r>
+    </w:p>
+    <w:p>
+      <w:pPr>
+        <w:spacing w:line="324" w:lineRule="auto" w:after="200"/>
+      </w:pPr>
+      <w:r>
+        <w:rPr>
+          <w:rFonts w:ascii="微软雅黑" w:hAnsi="微软雅黑"/>
+          <w:sz w:val="24"/>
+        </w:rPr>
+        <w:t>以下模块分析来自旧RTX PRO6000，新卡尚未重测模块占比。首轮profile沿用四段固定输入，每段25帧，预热一次、正式重复两次，不改权重和精度。分阶段同步是为了归因，因此这些阶段耗时不能替换Table 3A的正式测速结果。每段约12.626秒模型段中，RGB VAE编码约2.739秒，CoC VAE编码约2.516秒，重叠拼接与时序VAE解码约4.975秒，三项合计约81%；UNet约2.258秒。</w:t>
+      </w:r>
+    </w:p>
+    <w:p>
+      <w:pPr>
+        <w:spacing w:line="324" w:lineRule="auto" w:after="200"/>
+      </w:pPr>
+      <w:r>
+        <w:rPr>
+          <w:rFonts w:ascii="微软雅黑" w:hAnsi="微软雅黑"/>
+          <w:sz w:val="24"/>
+        </w:rPr>
+        <w:t>RGB和CoC编码阶段的Torch allocated峰值都约34.29 GiB；重叠拼接与解码阶段约29.65 GiB，UNet约14.39 GiB。这些是含常驻权重和缓存的绝对峰值，不能相加，也不能与旧卡Table 3A约38.47 GiB的设备占用采样值混为同一口径。持续RGB特征缓存约6.47 GiB，其中最高分辨率一级占4.5 GiB。</w:t>
+      </w:r>
+    </w:p>
+    <w:p>
+      <w:pPr>
+        <w:spacing w:line="324" w:lineRule="auto" w:after="200"/>
+      </w:pPr>
+      <w:r>
+        <w:rPr>
+          <w:rFonts w:ascii="微软雅黑" w:hAnsi="微软雅黑"/>
+          <w:sz w:val="24"/>
+        </w:rPr>
+        <w:t>每25个最终输出帧，RGB和CoC分别处理48个编码帧槽，解码处理32个帧槽，包含窗口重叠和padding。但是重复数量不等于可以无损删掉的计算，因为还涉及随机采样、缓存索引和时序解码上下文。目前只定位了成本来源，没有验证任何优化已经提速、降显存或保持质量。Table 3B正式保留25帧E2E；与Table 3A模型成本分开，不属于低帧率Track B。</w:t>
       </w:r>
     </w:p>
     <w:p>
@@ -390,55 +395,55 @@
           <w:b/>
           <w:sz w:val="40"/>
         </w:rPr>
-        <w:t>07  下一步：机制验证与失败分析</w:t>
-      </w:r>
-    </w:p>
-    <w:p>
-      <w:pPr>
-        <w:spacing w:line="324" w:lineRule="auto" w:after="200"/>
-      </w:pPr>
-      <w:r>
-        <w:rPr>
-          <w:rFonts w:ascii="微软雅黑" w:hAnsi="微软雅黑"/>
-          <w:sz w:val="24"/>
-        </w:rPr>
-        <w:t>第一，已完成的MagicBokeh B原生验证、候选选择、200×25评价和同配置成本不重跑。Synthetic七方法、DAVIS六方法和正式模型成本继续冻结，不根据后续自研结果调整baseline。</w:t>
-      </w:r>
-    </w:p>
-    <w:p>
-      <w:pPr>
-        <w:spacing w:line="324" w:lineRule="auto" w:after="200"/>
-      </w:pPr>
-      <w:r>
-        <w:rPr>
-          <w:rFonts w:ascii="微软雅黑" w:hAnsi="微软雅黑"/>
-          <w:sz w:val="24"/>
-        </w:rPr>
-        <w:t>第二，针对ATB做最小受控效率验证。先区分FP32编码激活与持续RGB缓存的贡献，再选择一个因素改变，例如编码批量或缓存策略。比较时间、显存及输出差异，保留随机流、缓存索引和时序解码语义。CoC编码同样达到峰值，因此不能提前承诺只清理旧RGB缓存就能降低总峰值。</w:t>
-      </w:r>
-    </w:p>
-    <w:p>
-      <w:pPr>
-        <w:spacing w:line="324" w:lineRule="auto" w:after="200"/>
-      </w:pPr>
-      <w:r>
-        <w:rPr>
-          <w:rFonts w:ascii="微软雅黑" w:hAnsi="微软雅黑"/>
-          <w:sz w:val="24"/>
-        </w:rPr>
-        <w:t>第三，从现有Synthetic与DAVIS结果中固定可重复失败场景，重点看主体边界、遮挡、细结构、大运动、强虚化和控制变化。每个问题都需要现象、可重复证据、可能机制和最小验证；不能根据想做的模块反向挑案例。动态控制等新专项仅在现有证据指向它时再开展。</w:t>
-      </w:r>
-    </w:p>
-    <w:p>
-      <w:pPr>
-        <w:spacing w:line="324" w:lineRule="auto" w:after="200"/>
-      </w:pPr>
-      <w:r>
-        <w:rPr>
-          <w:rFonts w:ascii="微软雅黑" w:hAnsi="微软雅黑"/>
-          <w:sz w:val="24"/>
-        </w:rPr>
-        <w:t>第四，在效率验证和失败分析形成证据后确定Ours，优先选能做清晰消融、改动可控的问题。低帧率补全、Token Merging和三头结构仍是候选，不是必须实现项；Track B和OPPO-style专项当前不作为前置。下一次汇报可以继续补受控实验结果，但不能把未运行的想法写成已验证改进。</w:t>
+        <w:t>07  性能评价状态与待测项</w:t>
+      </w:r>
+    </w:p>
+    <w:p>
+      <w:pPr>
+        <w:spacing w:line="324" w:lineRule="auto" w:after="200"/>
+      </w:pPr>
+      <w:r>
+        <w:rPr>
+          <w:rFonts w:ascii="微软雅黑" w:hAnsi="微软雅黑"/>
+          <w:sz w:val="24"/>
+        </w:rPr>
+        <w:t>第一，七方法Synthetic、六方法DAVIS和新旧GPU的3A结果继续保留。旧机六方法3B已有实测，新4090 D尚未复测完整25帧E2E，MagicBokeh B也没有3B结果。缺项标待测，不能用模型时间乘25代填。</w:t>
+      </w:r>
+    </w:p>
+    <w:p>
+      <w:pPr>
+        <w:spacing w:line="324" w:lineRule="auto" w:after="200"/>
+      </w:pPr>
+      <w:r>
+        <w:rPr>
+          <w:rFonts w:ascii="微软雅黑" w:hAnsi="微软雅黑"/>
+          <w:sz w:val="24"/>
+        </w:rPr>
+        <w:t>第二，后续若补新卡3B，应按冻结E2E-given-inputs边界完成完整25帧流水；MagicBokeh需要在执行前明确自身估深、目标选点、颜色后处理等方法内步骤。当前只更正表格，没有启动补测。</w:t>
+      </w:r>
+    </w:p>
+    <w:p>
+      <w:pPr>
+        <w:spacing w:line="324" w:lineRule="auto" w:after="200"/>
+      </w:pPr>
+      <w:r>
+        <w:rPr>
+          <w:rFonts w:ascii="微软雅黑" w:hAnsi="微软雅黑"/>
+          <w:sz w:val="24"/>
+        </w:rPr>
+        <w:t>第三，Track B是低帧率几何评价，Table 3B是视频端到端效率，两者没有从属关系。低帧率路线和原Table4继续暂停，3A和3B都保留。</w:t>
+      </w:r>
+    </w:p>
+    <w:p>
+      <w:pPr>
+        <w:spacing w:line="324" w:lineRule="auto" w:after="200"/>
+      </w:pPr>
+      <w:r>
+        <w:rPr>
+          <w:rFonts w:ascii="微软雅黑" w:hAnsi="微软雅黑"/>
+          <w:sz w:val="24"/>
+        </w:rPr>
+        <w:t>第四，编码分批、缓存优化、失败场景分析和Ours设计仍是后续候选。本轮不执行这些方案，等待后续明确任务。</w:t>
       </w:r>
     </w:p>
     <w:p>
@@ -575,6 +580,16 @@
     <w:p>
       <w:r>
         <w:t>证据：magicbokeh-track-a-200-20260930.json；magicbokeh-frozen-B-table3-20260930.json；any2bokeh-native-module-profile-20260930.json。原0930已汇报版本保留，本稿汇报日期待定。</w:t>
+      </w:r>
+    </w:p>
+    <w:p>
+      <w:r>
+        <w:t>本次更正证据：table3-4090d-20261001.json（新卡3A）；efficiency-3b-final-review-20260930.json（旧机3B）。原始记录与0930已汇报原稿不变。</w:t>
+      </w:r>
+    </w:p>
+    <w:p>
+      <w:r>
+        <w:t>合并效率表保留DeepLens CPU行：GPU模型成本3A不适用；新机CPU上的25帧E2E和RSS也待测。其余六方法3A为4090 D实测，3B同样待测。CPU RSS与GPU显存分别解释，不作同质内存排序。</w:t>
       </w:r>
     </w:p>
     <w:sectPr>

</xml_diff>

<commit_message>
report: split efficiency slides and use descriptive presentation labels
</commit_message>
<xml_diff>
--- a/汇报/下次汇报草稿_基线更新与ATB分析/基线更新与ATB效率分析_讲稿草稿.docx
+++ b/汇报/下次汇报草稿_基线更新与ATB分析/基线更新与ATB效率分析_讲稿草稿.docx
@@ -60,7 +60,7 @@
           <w:rFonts w:ascii="微软雅黑" w:hAnsi="微软雅黑"/>
           <w:sz w:val="24"/>
         </w:rPr>
-        <w:t>MagicBokeh采用用户选定的Target-guided Depth-Medoid B：在GT可见目标安全区域里，依据自身预测深度选择接近区域中位深度的实际像素；焦点数值读取这个像素的预测深度。GT数值深度和alpha不送入生成器，但GT区域参与选点这一额外权限必须披露。逐帧没有时序平滑，虚化强度、分块及颜色后处理均沿用冻结实现。</w:t>
+        <w:t>MagicBokeh采用用户选定的目标辅助深度选点配置：在GT可见目标安全区域里，依据自身预测深度选择接近区域中位深度的实际像素；焦点数值读取这个像素的预测深度。GT数值深度和alpha不送入生成器，但GT区域参与选点这一额外权限必须披露。逐帧没有时序平滑，虚化强度、分块及颜色后处理均沿用冻结实现。</w:t>
       </w:r>
     </w:p>
     <w:p>
@@ -150,7 +150,7 @@
           <w:rFonts w:ascii="微软雅黑" w:hAnsi="微软雅黑"/>
           <w:sz w:val="24"/>
         </w:rPr>
-        <w:t>这页在原有六种方法的复现结果中加入MagicBokeh B。上表是我们在公开代理合成集上的实测，下表保留原论文报告值。MagicBokeh没有对应的Any-to-Bokeh论文行，因此不填写或虚构它的论文参照，也不纳入原六种方法的平均绝对偏差。</w:t>
+        <w:t>这页在原有六种方法的复现结果中加入MagicBokeh。上表是我们在公开代理合成集上的实测，下表保留原论文报告值。MagicBokeh没有对应的Any-to-Bokeh论文行，因此不填写或虚构它的论文参照，也不纳入原六种方法的平均绝对偏差。</w:t>
       </w:r>
     </w:p>
     <w:p>
@@ -186,7 +186,7 @@
           <w:rFonts w:ascii="微软雅黑" w:hAnsi="微软雅黑"/>
           <w:sz w:val="24"/>
         </w:rPr>
-        <w:t>Any-to-Bokeh仍在这些指标上领先。MagicBokeh B的PSNR为25.1202 dB、SSIM为0.799536、LPIPS为0.197734、FVD为97.7899、FD为0.870974、RM为0.026840；补充的VFID-I为14.9854。它在当前代理集与控制协议下距离GT较远，但不能把这些差距唯一归因于模型能力：估深、目标控制、图块生成及颜色处理都和ATB不同。</w:t>
+        <w:t>Any-to-Bokeh仍在这些指标上领先。MagicBokeh的PSNR为25.1202 dB、SSIM为0.799536、LPIPS为0.197734、FVD为97.7899、FD为0.870974、RM为0.026840；补充的VFID-I为14.9854。它在当前代理集与控制协议下距离GT较远，但不能把这些差距唯一归因于模型能力：估深、目标控制、图块生成及颜色处理都和ATB不同。</w:t>
       </w:r>
     </w:p>
     <w:p>
@@ -282,19 +282,19 @@
           <w:b/>
           <w:sz w:val="40"/>
         </w:rPr>
-        <w:t>05  模型与端到端效率：Table 3A / 3B合并展示</w:t>
-      </w:r>
-    </w:p>
-    <w:p>
-      <w:pPr>
-        <w:spacing w:line="324" w:lineRule="auto" w:after="200"/>
-      </w:pPr>
-      <w:r>
-        <w:rPr>
-          <w:rFonts w:ascii="微软雅黑" w:hAnsi="微软雅黑"/>
-          <w:sz w:val="24"/>
-        </w:rPr>
-        <w:t>Table 3A比较模型段成本。当前页为2026-10-01在4090 D上的六种GPU方法复测：固定四个输入、各预热一次和正式五次。参数量复用，完整GFLOPs继续N/A；模型加载、读取与外围前后处理不计。旧RTX PRO6000结果单独保留，不能与新卡混算方法加速比。</w:t>
+        <w:t>05  模型计算成本</w:t>
+      </w:r>
+    </w:p>
+    <w:p>
+      <w:pPr>
+        <w:spacing w:line="324" w:lineRule="auto" w:after="200"/>
+      </w:pPr>
+      <w:r>
+        <w:rPr>
+          <w:rFonts w:ascii="微软雅黑" w:hAnsi="微软雅黑"/>
+          <w:sz w:val="24"/>
+        </w:rPr>
+        <w:t>模型计算成本表比较模型段成本。当前页为2026-10-01在4090 D上的六种GPU方法复测：固定四个输入、各预热一次和正式五次。参数量复用，完整GFLOPs继续N/A；模型加载、读取与外围前后处理不计。旧RTX PRO6000结果单独保留，不能与新卡混算方法加速比。</w:t>
       </w:r>
     </w:p>
     <w:p>
@@ -318,7 +318,7 @@
           <w:rFonts w:ascii="微软雅黑" w:hAnsi="微软雅黑"/>
           <w:sz w:val="24"/>
         </w:rPr>
-        <w:t>MagicBokeh B实际调用的生成器参数约1398.545M，设备采样峰值约5.13 GiB，Torch allocated峰值约3.89 GiB。这里不计DAdepth估深、GT目标辅助选点、条件构造和CPU PIL/AdaIN颜色处理。相对于ATB，当前生成器路径显存更低，但全帧单位输出时间更长；单步标签不能直接说明它更快。这不是完整RGB到虚化的端到端成本。</w:t>
+        <w:t>MagicBokeh实际调用的生成器参数约1398.545M，设备采样峰值约5.13 GiB，Torch allocated峰值约3.89 GiB。这里不计DAdepth估深、GT目标辅助选点、条件构造和CPU PIL/AdaIN颜色处理。相对于ATB，当前生成器路径显存更低，但全帧单位输出时间更长；单步标签不能直接说明它更快。这不是完整RGB到虚化的端到端成本。</w:t>
       </w:r>
     </w:p>
     <w:p>
@@ -328,9 +328,28 @@
     </w:p>
     <w:p>
       <w:r>
-        <w:t>同一页合并展示3A和3B，并统一使用4090 D。3A三列已填新卡实测：模型时间、参数量和采样显存；3B的25帧E2E、FPS及对应内存目前全部待测。完整E2E从读取给定输入到25张CPU输出，包含适配和必要方法处理，排除加载、外部geometry生成和写盘编码。不能把旧卡数字换成新卡标签，也不能用模型时间乘25当作E2E。旧卡3B仍作为正式历史硬件版本保存在协议和记录中，本页不混填。</w:t>
-      </w:r>
-    </w:p>
+        <w:rPr>
+          <w:b/>
+        </w:rPr>
+        <w:t>06  视频端到端效率</w:t>
+      </w:r>
+    </w:p>
+    <w:p>
+      <w:r>
+        <w:t>这一页单独呈现当前服务器处理完整25帧视频的耗时、FPS和峰值内存。六种GPU方法使用RTX 4090 D，DeepLens沿用CPU实现。目前这些完整流水尚未测量，所以所有数值明确标为待测，不把旧服务器结果搬过来，也不用上一页模型时间乘25代填。</w:t>
+      </w:r>
+    </w:p>
+    <w:p>
+      <w:r>
+        <w:t>计时从读入已给输入开始，包括适配、必要分层和修复、方法推理、传输及后处理，直到25张CPU RGB输出准备就绪。排除模型加载、首次CUDA context、benchmark外部geometry生成、最终写盘和视频编码。FPS等于25除以整段平均耗时。</w:t>
+      </w:r>
+    </w:p>
+    <w:p>
+      <w:r>
+        <w:t>DeepLens报告CPU进程内存，其余报告GPU设备采样显存，不能作同质内存排序。MagicBokeh的完整流水需在补测前明确自身估深、目标选点和CPU颜色校正等步骤的边界。旧服务器已有结果继续保存在项目记录中。</w:t>
+      </w:r>
+    </w:p>
+    <w:p/>
     <w:p>
       <w:pPr>
         <w:spacing w:after="320"/>
@@ -341,43 +360,43 @@
           <w:b/>
           <w:sz w:val="40"/>
         </w:rPr>
-        <w:t>06  ATB的主要成本集中在VAE（旧RTX PRO6000模块分析）</w:t>
-      </w:r>
-    </w:p>
-    <w:p>
-      <w:pPr>
-        <w:spacing w:line="324" w:lineRule="auto" w:after="200"/>
-      </w:pPr>
-      <w:r>
-        <w:rPr>
-          <w:rFonts w:ascii="微软雅黑" w:hAnsi="微软雅黑"/>
-          <w:sz w:val="24"/>
-        </w:rPr>
-        <w:t>以下模块分析来自旧RTX PRO6000，新卡尚未重测模块占比。首轮profile沿用四段固定输入，每段25帧，预热一次、正式重复两次，不改权重和精度。分阶段同步是为了归因，因此这些阶段耗时不能替换Table 3A的正式测速结果。每段约12.626秒模型段中，RGB VAE编码约2.739秒，CoC VAE编码约2.516秒，重叠拼接与时序VAE解码约4.975秒，三项合计约81%；UNet约2.258秒。</w:t>
-      </w:r>
-    </w:p>
-    <w:p>
-      <w:pPr>
-        <w:spacing w:line="324" w:lineRule="auto" w:after="200"/>
-      </w:pPr>
-      <w:r>
-        <w:rPr>
-          <w:rFonts w:ascii="微软雅黑" w:hAnsi="微软雅黑"/>
-          <w:sz w:val="24"/>
-        </w:rPr>
-        <w:t>RGB和CoC编码阶段的Torch allocated峰值都约34.29 GiB；重叠拼接与解码阶段约29.65 GiB，UNet约14.39 GiB。这些是含常驻权重和缓存的绝对峰值，不能相加，也不能与旧卡Table 3A约38.47 GiB的设备占用采样值混为同一口径。持续RGB特征缓存约6.47 GiB，其中最高分辨率一级占4.5 GiB。</w:t>
-      </w:r>
-    </w:p>
-    <w:p>
-      <w:pPr>
-        <w:spacing w:line="324" w:lineRule="auto" w:after="200"/>
-      </w:pPr>
-      <w:r>
-        <w:rPr>
-          <w:rFonts w:ascii="微软雅黑" w:hAnsi="微软雅黑"/>
-          <w:sz w:val="24"/>
-        </w:rPr>
-        <w:t>每25个最终输出帧，RGB和CoC分别处理48个编码帧槽，解码处理32个帧槽，包含窗口重叠和padding。但是重复数量不等于可以无损删掉的计算，因为还涉及随机采样、缓存索引和时序解码上下文。目前只定位了成本来源，没有验证任何优化已经提速、降显存或保持质量。Table 3B正式保留25帧E2E；与Table 3A模型成本分开，不属于低帧率Track B。</w:t>
+        <w:t>07  ATB的主要成本集中在VAE（旧RTX PRO6000模块分析）</w:t>
+      </w:r>
+    </w:p>
+    <w:p>
+      <w:pPr>
+        <w:spacing w:line="324" w:lineRule="auto" w:after="200"/>
+      </w:pPr>
+      <w:r>
+        <w:rPr>
+          <w:rFonts w:ascii="微软雅黑" w:hAnsi="微软雅黑"/>
+          <w:sz w:val="24"/>
+        </w:rPr>
+        <w:t>以下模块分析来自旧RTX PRO6000，新卡尚未重测模块占比。首轮profile沿用四段固定输入，每段25帧，预热一次、正式重复两次，不改权重和精度。分阶段同步是为了归因，因此这些阶段耗时不能替换模型计算成本表的正式测速结果。每段约12.626秒模型段中，RGB VAE编码约2.739秒，CoC VAE编码约2.516秒，重叠拼接与时序VAE解码约4.975秒，三项合计约81%；UNet约2.258秒。</w:t>
+      </w:r>
+    </w:p>
+    <w:p>
+      <w:pPr>
+        <w:spacing w:line="324" w:lineRule="auto" w:after="200"/>
+      </w:pPr>
+      <w:r>
+        <w:rPr>
+          <w:rFonts w:ascii="微软雅黑" w:hAnsi="微软雅黑"/>
+          <w:sz w:val="24"/>
+        </w:rPr>
+        <w:t>RGB和CoC编码阶段的Torch allocated峰值都约34.29 GiB；重叠拼接与解码阶段约29.65 GiB，UNet约14.39 GiB。这些是含常驻权重和缓存的绝对峰值，不能相加，也不能与旧卡模型计算成本表约38.47 GiB的设备占用采样值混为同一口径。持续RGB特征缓存约6.47 GiB，其中最高分辨率一级占4.5 GiB。</w:t>
+      </w:r>
+    </w:p>
+    <w:p>
+      <w:pPr>
+        <w:spacing w:line="324" w:lineRule="auto" w:after="200"/>
+      </w:pPr>
+      <w:r>
+        <w:rPr>
+          <w:rFonts w:ascii="微软雅黑" w:hAnsi="微软雅黑"/>
+          <w:sz w:val="24"/>
+        </w:rPr>
+        <w:t>每25个最终输出帧，RGB和CoC分别处理48个编码帧槽，解码处理32个帧槽，包含窗口重叠和padding。但是重复数量不等于可以无损删掉的计算，因为还涉及随机采样、缓存索引和时序解码上下文。目前只定位了成本来源，没有验证任何优化已经提速、降显存或保持质量。模型计算成本和完整视频流水分别评价；低帧率深度专项继续暂停。</w:t>
       </w:r>
     </w:p>
     <w:p>
@@ -395,43 +414,43 @@
           <w:b/>
           <w:sz w:val="40"/>
         </w:rPr>
-        <w:t>07  性能评价状态与待测项</w:t>
-      </w:r>
-    </w:p>
-    <w:p>
-      <w:pPr>
-        <w:spacing w:line="324" w:lineRule="auto" w:after="200"/>
-      </w:pPr>
-      <w:r>
-        <w:rPr>
-          <w:rFonts w:ascii="微软雅黑" w:hAnsi="微软雅黑"/>
-          <w:sz w:val="24"/>
-        </w:rPr>
-        <w:t>第一，七方法Synthetic、六方法DAVIS和新旧GPU的3A结果继续保留。旧机六方法3B已有实测，新4090 D尚未复测完整25帧E2E，MagicBokeh B也没有3B结果。缺项标待测，不能用模型时间乘25代填。</w:t>
-      </w:r>
-    </w:p>
-    <w:p>
-      <w:pPr>
-        <w:spacing w:line="324" w:lineRule="auto" w:after="200"/>
-      </w:pPr>
-      <w:r>
-        <w:rPr>
-          <w:rFonts w:ascii="微软雅黑" w:hAnsi="微软雅黑"/>
-          <w:sz w:val="24"/>
-        </w:rPr>
-        <w:t>第二，后续若补新卡3B，应按冻结E2E-given-inputs边界完成完整25帧流水；MagicBokeh需要在执行前明确自身估深、目标选点、颜色后处理等方法内步骤。当前只更正表格，没有启动补测。</w:t>
-      </w:r>
-    </w:p>
-    <w:p>
-      <w:pPr>
-        <w:spacing w:line="324" w:lineRule="auto" w:after="200"/>
-      </w:pPr>
-      <w:r>
-        <w:rPr>
-          <w:rFonts w:ascii="微软雅黑" w:hAnsi="微软雅黑"/>
-          <w:sz w:val="24"/>
-        </w:rPr>
-        <w:t>第三，Track B是低帧率几何评价，Table 3B是视频端到端效率，两者没有从属关系。低帧率路线和原Table4继续暂停，3A和3B都保留。</w:t>
+        <w:t>08  当前进度与下一步</w:t>
+      </w:r>
+    </w:p>
+    <w:p>
+      <w:pPr>
+        <w:spacing w:line="324" w:lineRule="auto" w:after="200"/>
+      </w:pPr>
+      <w:r>
+        <w:rPr>
+          <w:rFonts w:ascii="微软雅黑" w:hAnsi="微软雅黑"/>
+          <w:sz w:val="24"/>
+        </w:rPr>
+        <w:t>第一，七方法Synthetic、六方法DAVIS和新旧GPU的模型成本结果继续保留。旧机六方法端到端效率已有实测，新4090 D尚未复测完整25帧E2E，MagicBokeh也没有端到端效率结果。缺项标待测，不能用模型时间乘25代填。</w:t>
+      </w:r>
+    </w:p>
+    <w:p>
+      <w:pPr>
+        <w:spacing w:line="324" w:lineRule="auto" w:after="200"/>
+      </w:pPr>
+      <w:r>
+        <w:rPr>
+          <w:rFonts w:ascii="微软雅黑" w:hAnsi="微软雅黑"/>
+          <w:sz w:val="24"/>
+        </w:rPr>
+        <w:t>第二，后续若补新卡端到端效率，应按冻结E2E-given-inputs边界完成完整25帧流水；MagicBokeh需要在执行前明确自身估深、目标选点、颜色后处理等方法内步骤。当前只更正表格，没有启动补测。</w:t>
+      </w:r>
+    </w:p>
+    <w:p>
+      <w:pPr>
+        <w:spacing w:line="324" w:lineRule="auto" w:after="200"/>
+      </w:pPr>
+      <w:r>
+        <w:rPr>
+          <w:rFonts w:ascii="微软雅黑" w:hAnsi="微软雅黑"/>
+          <w:sz w:val="24"/>
+        </w:rPr>
+        <w:t>第三，模型计算成本与视频端到端效率都保留，分别回答模型本体的计算成本和完整视频流水的处理耗时。低帧率深度专项继续暂停，不影响这两张效率表。</w:t>
       </w:r>
     </w:p>
     <w:p>
@@ -580,16 +599,6 @@
     <w:p>
       <w:r>
         <w:t>证据：magicbokeh-track-a-200-20260930.json；magicbokeh-frozen-B-table3-20260930.json；any2bokeh-native-module-profile-20260930.json。原0930已汇报版本保留，本稿汇报日期待定。</w:t>
-      </w:r>
-    </w:p>
-    <w:p>
-      <w:r>
-        <w:t>本次更正证据：table3-4090d-20261001.json（新卡3A）；efficiency-3b-final-review-20260930.json（旧机3B）。原始记录与0930已汇报原稿不变。</w:t>
-      </w:r>
-    </w:p>
-    <w:p>
-      <w:r>
-        <w:t>合并效率表保留DeepLens CPU行：GPU模型成本3A不适用；新机CPU上的25帧E2E和RSS也待测。其余六方法3A为4090 D实测，3B同样待测。CPU RSS与GPU显存分别解释，不作同质内存排序。</w:t>
       </w:r>
     </w:p>
     <w:sectPr>

</xml_diff>

<commit_message>
report: restore original alternating blue-white table style
</commit_message>
<xml_diff>
--- a/汇报/下次汇报草稿_基线更新与ATB分析/基线更新与ATB效率分析_讲稿草稿.docx
+++ b/汇报/下次汇报草稿_基线更新与ATB分析/基线更新与ATB效率分析_讲稿草稿.docx
@@ -327,30 +327,6 @@
       </w:r>
     </w:p>
     <w:p>
-      <w:r>
-        <w:rPr>
-          <w:b/>
-        </w:rPr>
-        <w:t>06  视频端到端效率</w:t>
-      </w:r>
-    </w:p>
-    <w:p>
-      <w:r>
-        <w:t>这一页单独呈现当前服务器处理完整25帧视频的耗时、FPS和峰值内存。六种GPU方法使用RTX 4090 D，DeepLens沿用CPU实现。目前这些完整流水尚未测量，所以所有数值明确标为待测，不把旧服务器结果搬过来，也不用上一页模型时间乘25代填。</w:t>
-      </w:r>
-    </w:p>
-    <w:p>
-      <w:r>
-        <w:t>计时从读入已给输入开始，包括适配、必要分层和修复、方法推理、传输及后处理，直到25张CPU RGB输出准备就绪。排除模型加载、首次CUDA context、benchmark外部geometry生成、最终写盘和视频编码。FPS等于25除以整段平均耗时。</w:t>
-      </w:r>
-    </w:p>
-    <w:p>
-      <w:r>
-        <w:t>DeepLens报告CPU进程内存，其余报告GPU设备采样显存，不能作同质内存排序。MagicBokeh的完整流水需在补测前明确自身估深、目标选点和CPU颜色校正等步骤的边界。旧服务器已有结果继续保存在项目记录中。</w:t>
-      </w:r>
-    </w:p>
-    <w:p/>
-    <w:p>
       <w:pPr>
         <w:spacing w:after="320"/>
       </w:pPr>
@@ -360,50 +336,46 @@
           <w:b/>
           <w:sz w:val="40"/>
         </w:rPr>
-        <w:t>07  ATB的主要成本集中在VAE（旧RTX PRO6000模块分析）</w:t>
-      </w:r>
-    </w:p>
-    <w:p>
-      <w:pPr>
-        <w:spacing w:line="324" w:lineRule="auto" w:after="200"/>
-      </w:pPr>
-      <w:r>
-        <w:rPr>
-          <w:rFonts w:ascii="微软雅黑" w:hAnsi="微软雅黑"/>
-          <w:sz w:val="24"/>
-        </w:rPr>
-        <w:t>以下模块分析来自旧RTX PRO6000，新卡尚未重测模块占比。首轮profile沿用四段固定输入，每段25帧，预热一次、正式重复两次，不改权重和精度。分阶段同步是为了归因，因此这些阶段耗时不能替换模型计算成本表的正式测速结果。每段约12.626秒模型段中，RGB VAE编码约2.739秒，CoC VAE编码约2.516秒，重叠拼接与时序VAE解码约4.975秒，三项合计约81%；UNet约2.258秒。</w:t>
-      </w:r>
-    </w:p>
-    <w:p>
-      <w:pPr>
-        <w:spacing w:line="324" w:lineRule="auto" w:after="200"/>
-      </w:pPr>
-      <w:r>
-        <w:rPr>
-          <w:rFonts w:ascii="微软雅黑" w:hAnsi="微软雅黑"/>
-          <w:sz w:val="24"/>
-        </w:rPr>
-        <w:t>RGB和CoC编码阶段的Torch allocated峰值都约34.29 GiB；重叠拼接与解码阶段约29.65 GiB，UNet约14.39 GiB。这些是含常驻权重和缓存的绝对峰值，不能相加，也不能与旧卡模型计算成本表约38.47 GiB的设备占用采样值混为同一口径。持续RGB特征缓存约6.47 GiB，其中最高分辨率一级占4.5 GiB。</w:t>
-      </w:r>
-    </w:p>
-    <w:p>
-      <w:pPr>
-        <w:spacing w:line="324" w:lineRule="auto" w:after="200"/>
-      </w:pPr>
-      <w:r>
-        <w:rPr>
-          <w:rFonts w:ascii="微软雅黑" w:hAnsi="微软雅黑"/>
-          <w:sz w:val="24"/>
-        </w:rPr>
-        <w:t>每25个最终输出帧，RGB和CoC分别处理48个编码帧槽，解码处理32个帧槽，包含窗口重叠和padding。但是重复数量不等于可以无损删掉的计算，因为还涉及随机采样、缓存索引和时序解码上下文。目前只定位了成本来源，没有验证任何优化已经提速、降显存或保持质量。模型计算成本和完整视频流水分别评价；低帧率深度专项继续暂停。</w:t>
-      </w:r>
-    </w:p>
-    <w:p>
-      <w:r>
-        <w:br w:type="page"/>
-      </w:r>
-    </w:p>
+        <w:t>06  视频端到端效率</w:t>
+      </w:r>
+    </w:p>
+    <w:p>
+      <w:pPr>
+        <w:spacing w:line="324" w:lineRule="auto" w:after="200"/>
+      </w:pPr>
+      <w:r>
+        <w:rPr>
+          <w:rFonts w:ascii="微软雅黑" w:hAnsi="微软雅黑"/>
+          <w:sz w:val="24"/>
+        </w:rPr>
+        <w:t>这一页单独呈现当前服务器处理完整25帧视频的耗时、FPS和峰值内存。六种GPU方法使用RTX 4090 D，DeepLens沿用CPU实现。目前这些完整流水尚未测量，所以所有数值明确标为待测，不把旧服务器结果搬过来，也不用上一页模型时间乘25代填。</w:t>
+      </w:r>
+    </w:p>
+    <w:p>
+      <w:pPr>
+        <w:spacing w:line="324" w:lineRule="auto" w:after="200"/>
+      </w:pPr>
+      <w:r>
+        <w:rPr>
+          <w:rFonts w:ascii="微软雅黑" w:hAnsi="微软雅黑"/>
+          <w:sz w:val="24"/>
+        </w:rPr>
+        <w:t>计时从读入已给输入开始，包括适配、必要分层和修复、方法推理、传输及后处理，直到25张CPU RGB输出准备就绪。排除模型加载、首次CUDA context、benchmark外部geometry生成、最终写盘和视频编码。FPS等于25除以整段平均耗时。</w:t>
+      </w:r>
+    </w:p>
+    <w:p>
+      <w:pPr>
+        <w:spacing w:line="324" w:lineRule="auto" w:after="200"/>
+      </w:pPr>
+      <w:r>
+        <w:rPr>
+          <w:rFonts w:ascii="微软雅黑" w:hAnsi="微软雅黑"/>
+          <w:sz w:val="24"/>
+        </w:rPr>
+        <w:t>DeepLens报告CPU进程内存，其余报告GPU设备采样显存，不能作同质内存排序。MagicBokeh的完整流水需在补测前明确自身估深、目标选点和CPU颜色校正等步骤的边界。旧服务器已有结果继续保存在项目记录中。</w:t>
+      </w:r>
+    </w:p>
+    <w:p/>
     <w:p>
       <w:pPr>
         <w:spacing w:after="320"/>
@@ -414,55 +386,43 @@
           <w:b/>
           <w:sz w:val="40"/>
         </w:rPr>
-        <w:t>08  当前进度与下一步</w:t>
-      </w:r>
-    </w:p>
-    <w:p>
-      <w:pPr>
-        <w:spacing w:line="324" w:lineRule="auto" w:after="200"/>
-      </w:pPr>
-      <w:r>
-        <w:rPr>
-          <w:rFonts w:ascii="微软雅黑" w:hAnsi="微软雅黑"/>
-          <w:sz w:val="24"/>
-        </w:rPr>
-        <w:t>第一，七方法Synthetic、六方法DAVIS和新旧GPU的模型成本结果继续保留。旧机六方法端到端效率已有实测，新4090 D尚未复测完整25帧E2E，MagicBokeh也没有端到端效率结果。缺项标待测，不能用模型时间乘25代填。</w:t>
-      </w:r>
-    </w:p>
-    <w:p>
-      <w:pPr>
-        <w:spacing w:line="324" w:lineRule="auto" w:after="200"/>
-      </w:pPr>
-      <w:r>
-        <w:rPr>
-          <w:rFonts w:ascii="微软雅黑" w:hAnsi="微软雅黑"/>
-          <w:sz w:val="24"/>
-        </w:rPr>
-        <w:t>第二，后续若补新卡端到端效率，应按冻结E2E-given-inputs边界完成完整25帧流水；MagicBokeh需要在执行前明确自身估深、目标选点、颜色后处理等方法内步骤。当前只更正表格，没有启动补测。</w:t>
-      </w:r>
-    </w:p>
-    <w:p>
-      <w:pPr>
-        <w:spacing w:line="324" w:lineRule="auto" w:after="200"/>
-      </w:pPr>
-      <w:r>
-        <w:rPr>
-          <w:rFonts w:ascii="微软雅黑" w:hAnsi="微软雅黑"/>
-          <w:sz w:val="24"/>
-        </w:rPr>
-        <w:t>第三，模型计算成本与视频端到端效率都保留，分别回答模型本体的计算成本和完整视频流水的处理耗时。低帧率深度专项继续暂停，不影响这两张效率表。</w:t>
-      </w:r>
-    </w:p>
-    <w:p>
-      <w:pPr>
-        <w:spacing w:line="324" w:lineRule="auto" w:after="200"/>
-      </w:pPr>
-      <w:r>
-        <w:rPr>
-          <w:rFonts w:ascii="微软雅黑" w:hAnsi="微软雅黑"/>
-          <w:sz w:val="24"/>
-        </w:rPr>
-        <w:t>第四，编码分批、缓存优化、失败场景分析和Ours设计仍是后续候选。本轮不执行这些方案，等待后续明确任务。</w:t>
+        <w:t>07  ATB的主要成本集中在VAE（旧RTX PRO6000模块分析）</w:t>
+      </w:r>
+    </w:p>
+    <w:p>
+      <w:pPr>
+        <w:spacing w:line="324" w:lineRule="auto" w:after="200"/>
+      </w:pPr>
+      <w:r>
+        <w:rPr>
+          <w:rFonts w:ascii="微软雅黑" w:hAnsi="微软雅黑"/>
+          <w:sz w:val="24"/>
+        </w:rPr>
+        <w:t>以下模块分析来自旧RTX PRO6000，新卡尚未重测模块占比。首轮profile沿用四段固定输入，每段25帧，预热一次、正式重复两次，不改权重和精度。分阶段同步是为了归因，因此这些阶段耗时不能替换模型计算成本表的正式测速结果。每段约12.626秒模型段中，RGB VAE编码约2.739秒，CoC VAE编码约2.516秒，重叠拼接与时序VAE解码约4.975秒，三项合计约81%；UNet约2.258秒。</w:t>
+      </w:r>
+    </w:p>
+    <w:p>
+      <w:pPr>
+        <w:spacing w:line="324" w:lineRule="auto" w:after="200"/>
+      </w:pPr>
+      <w:r>
+        <w:rPr>
+          <w:rFonts w:ascii="微软雅黑" w:hAnsi="微软雅黑"/>
+          <w:sz w:val="24"/>
+        </w:rPr>
+        <w:t>RGB和CoC编码阶段的Torch allocated峰值都约34.29 GiB；重叠拼接与解码阶段约29.65 GiB，UNet约14.39 GiB。这些是含常驻权重和缓存的绝对峰值，不能相加，也不能与旧卡模型计算成本表约38.47 GiB的设备占用采样值混为同一口径。持续RGB特征缓存约6.47 GiB，其中最高分辨率一级占4.5 GiB。</w:t>
+      </w:r>
+    </w:p>
+    <w:p>
+      <w:pPr>
+        <w:spacing w:line="324" w:lineRule="auto" w:after="200"/>
+      </w:pPr>
+      <w:r>
+        <w:rPr>
+          <w:rFonts w:ascii="微软雅黑" w:hAnsi="微软雅黑"/>
+          <w:sz w:val="24"/>
+        </w:rPr>
+        <w:t>每25个最终输出帧，RGB和CoC分别处理48个编码帧槽，解码处理32个帧槽，包含窗口重叠和padding。但是重复数量不等于可以无损删掉的计算，因为还涉及随机采样、缓存索引和时序解码上下文。目前只定位了成本来源，没有验证任何优化已经提速、降显存或保持质量。模型计算成本和完整视频流水分别评价；低帧率深度专项继续暂停。</w:t>
       </w:r>
     </w:p>
     <w:p>
@@ -480,6 +440,72 @@
           <w:b/>
           <w:sz w:val="40"/>
         </w:rPr>
+        <w:t>08  当前进度与下一步</w:t>
+      </w:r>
+    </w:p>
+    <w:p>
+      <w:pPr>
+        <w:spacing w:line="324" w:lineRule="auto" w:after="200"/>
+      </w:pPr>
+      <w:r>
+        <w:rPr>
+          <w:rFonts w:ascii="微软雅黑" w:hAnsi="微软雅黑"/>
+          <w:sz w:val="24"/>
+        </w:rPr>
+        <w:t>第一，七方法Synthetic、六方法DAVIS和新旧GPU的模型成本结果继续保留。旧机六方法端到端效率已有实测，新4090 D尚未复测完整25帧E2E，MagicBokeh也没有端到端效率结果。缺项标待测，不能用模型时间乘25代填。</w:t>
+      </w:r>
+    </w:p>
+    <w:p>
+      <w:pPr>
+        <w:spacing w:line="324" w:lineRule="auto" w:after="200"/>
+      </w:pPr>
+      <w:r>
+        <w:rPr>
+          <w:rFonts w:ascii="微软雅黑" w:hAnsi="微软雅黑"/>
+          <w:sz w:val="24"/>
+        </w:rPr>
+        <w:t>第二，后续若补新卡端到端效率，应按冻结E2E-given-inputs边界完成完整25帧流水；MagicBokeh需要在执行前明确自身估深、目标选点、颜色后处理等方法内步骤。当前只更正表格，没有启动补测。</w:t>
+      </w:r>
+    </w:p>
+    <w:p>
+      <w:pPr>
+        <w:spacing w:line="324" w:lineRule="auto" w:after="200"/>
+      </w:pPr>
+      <w:r>
+        <w:rPr>
+          <w:rFonts w:ascii="微软雅黑" w:hAnsi="微软雅黑"/>
+          <w:sz w:val="24"/>
+        </w:rPr>
+        <w:t>第三，模型计算成本与视频端到端效率都保留，分别回答模型本体的计算成本和完整视频流水的处理耗时。低帧率深度专项继续暂停，不影响这两张效率表。</w:t>
+      </w:r>
+    </w:p>
+    <w:p>
+      <w:pPr>
+        <w:spacing w:line="324" w:lineRule="auto" w:after="200"/>
+      </w:pPr>
+      <w:r>
+        <w:rPr>
+          <w:rFonts w:ascii="微软雅黑" w:hAnsi="微软雅黑"/>
+          <w:sz w:val="24"/>
+        </w:rPr>
+        <w:t>第四，编码分批、缓存优化、失败场景分析和Ours设计仍是后续候选。本轮不执行这些方案，等待后续明确任务。</w:t>
+      </w:r>
+    </w:p>
+    <w:p>
+      <w:r>
+        <w:br w:type="page"/>
+      </w:r>
+    </w:p>
+    <w:p>
+      <w:pPr>
+        <w:spacing w:after="320"/>
+      </w:pPr>
+      <w:r>
+        <w:rPr>
+          <w:rFonts w:ascii="微软雅黑" w:hAnsi="微软雅黑"/>
+          <w:b/>
+          <w:sz w:val="40"/>
+        </w:rPr>
         <w:t>附  指标说明</w:t>
       </w:r>
     </w:p>
@@ -597,7 +623,14 @@
       </w:r>
     </w:p>
     <w:p>
-      <w:r>
+      <w:pPr>
+        <w:spacing w:line="324" w:lineRule="auto" w:after="200"/>
+      </w:pPr>
+      <w:r>
+        <w:rPr>
+          <w:rFonts w:ascii="微软雅黑" w:hAnsi="微软雅黑"/>
+          <w:sz w:val="24"/>
+        </w:rPr>
         <w:t>证据：magicbokeh-track-a-200-20260930.json；magicbokeh-frozen-B-table3-20260930.json；any2bokeh-native-module-profile-20260930.json。原0930已汇报版本保留，本稿汇报日期待定。</w:t>
       </w:r>
     </w:p>

</xml_diff>

<commit_message>
Complete seven-method video E2E tests and update efficiency reports
</commit_message>
<xml_diff>
--- a/汇报/下次汇报草稿_基线更新与ATB分析/基线更新与ATB效率分析_讲稿草稿.docx
+++ b/汇报/下次汇报草稿_基线更新与ATB分析/基线更新与ATB效率分析_讲稿草稿.docx
@@ -348,7 +348,7 @@
           <w:rFonts w:ascii="微软雅黑" w:hAnsi="微软雅黑"/>
           <w:sz w:val="24"/>
         </w:rPr>
-        <w:t>这一页单独呈现当前服务器处理完整25帧视频的耗时、FPS和峰值内存。六种GPU方法使用RTX 4090 D，DeepLens沿用CPU实现。目前这些完整流水尚未测量，所以所有数值明确标为待测，不把旧服务器结果搬过来，也不用上一页模型时间乘25代填。</w:t>
+        <w:t>这一页呈现当前服务器的完整25帧实测。六种GPU方法使用RTX 4090 D，DeepLens使用Xeon Platinum 8481C的TF1.15 CPU路径。四个固定输入各预热一次、正式五次，七方法共140次正式测量。ATB的Core为20.113秒，E2E为21.860秒，吞吐率为1.144fps。视频时间来自实际完整25帧执行，不由模型单帧时间外推。</w:t>
       </w:r>
     </w:p>
     <w:p>
@@ -372,7 +372,7 @@
           <w:rFonts w:ascii="微软雅黑" w:hAnsi="微软雅黑"/>
           <w:sz w:val="24"/>
         </w:rPr>
-        <w:t>DeepLens报告CPU进程内存，其余报告GPU设备采样显存，不能作同质内存排序。MagicBokeh的完整流水需在补测前明确自身估深、目标选点和CPU颜色校正等步骤的边界。旧服务器已有结果继续保存在项目记录中。</w:t>
+        <w:t>DeepLens固定intra-op8线程、inter-op1线程；Core为46.733秒，E2E为48.789秒，CPU RSS采样峰值为1.524GiB。其余方法报告GPU设备采样显存，PyTorch allocated/reserved另存，CPU与GPU内存不能作同质排序。MagicBokeh本次包含每帧重新估深、GT目标辅助选点、条件构造/传输、六图块生成与拼接，以及PIL/AdaIN颜色处理；其Core为32.571秒，E2E为36.570秒。Core包含估深网络forward和生成器GPU段，因此与上一页generator-only模型成本的边界不同。外部benchmark标注生成、模型加载、最终写盘、编码和指标计算不计。</w:t>
       </w:r>
     </w:p>
     <w:p/>
@@ -452,19 +452,19 @@
           <w:rFonts w:ascii="微软雅黑" w:hAnsi="微软雅黑"/>
           <w:sz w:val="24"/>
         </w:rPr>
-        <w:t>第一，七方法Synthetic、六方法DAVIS和新旧GPU的模型成本结果继续保留。旧机六方法端到端效率已有实测，新4090 D尚未复测完整25帧E2E，MagicBokeh也没有端到端效率结果。缺项标待测，不能用模型时间乘25代填。</w:t>
-      </w:r>
-    </w:p>
-    <w:p>
-      <w:pPr>
-        <w:spacing w:line="324" w:lineRule="auto" w:after="200"/>
-      </w:pPr>
-      <w:r>
-        <w:rPr>
-          <w:rFonts w:ascii="微软雅黑" w:hAnsi="微软雅黑"/>
-          <w:sz w:val="24"/>
-        </w:rPr>
-        <w:t>第二，后续若补新卡端到端效率，应按冻结E2E-given-inputs边界完成完整25帧流水；MagicBokeh需要在执行前明确自身估深、目标选点、颜色后处理等方法内步骤。当前只更正表格，没有启动补测。</w:t>
+        <w:t>第一，七方法Synthetic、六方法DAVIS和新旧GPU模型成本结果继续保留。本轮只补当前服务器的七方法视频端到端效率，完成完整25帧、四输入、各预热一次和正式五次的测量。旧PRO 6000 Blackwell及Xeon 8470Q结果按原硬件标注保留；旧机MagicBokeh没有视频E2E记录，继续留空。</w:t>
+      </w:r>
+    </w:p>
+    <w:p>
+      <w:pPr>
+        <w:spacing w:line="324" w:lineRule="auto" w:after="200"/>
+      </w:pPr>
+      <w:r>
+        <w:rPr>
+          <w:rFonts w:ascii="微软雅黑" w:hAnsi="微软雅黑"/>
+          <w:sz w:val="24"/>
+        </w:rPr>
+        <w:t>第二，当前服务器的视频端到端效率已完成；每次的Core、E2E、FPS、显存或RSS以及原始日志均已保存。均值、标准差和每K统计来自重复实测。新旧机器的GPU、CPU及环境存在差异，两张表服务于各自明确的成本边界，不将跨机差异解释为模型优化收益。</w:t>
       </w:r>
     </w:p>
     <w:p>

</xml_diff>

<commit_message>
report: document ATB memory/time breakdown for 4090 D
Reproduction report gains the stage, memory-composition and unit-scale
experiment tables; draft deck slides 07/08 and the speech draft follow.

Co-Authored-By: Claude Opus 5.5 (1M context) <noreply@anthropic.com>
</commit_message>
<xml_diff>
--- a/汇报/下次汇报草稿_基线更新与ATB分析/基线更新与ATB效率分析_讲稿草稿.docx
+++ b/汇报/下次汇报草稿_基线更新与ATB分析/基线更新与ATB效率分析_讲稿草稿.docx
@@ -386,48 +386,139 @@
           <w:b/>
           <w:sz w:val="40"/>
         </w:rPr>
-        <w:t>07  ATB的主要成本集中在VAE（旧RTX PRO6000模块分析）</w:t>
-      </w:r>
-    </w:p>
-    <w:p>
-      <w:pPr>
-        <w:spacing w:line="324" w:lineRule="auto" w:after="200"/>
-      </w:pPr>
-      <w:r>
-        <w:rPr>
-          <w:rFonts w:ascii="微软雅黑" w:hAnsi="微软雅黑"/>
-          <w:sz w:val="24"/>
-        </w:rPr>
-        <w:t>以下模块分析来自旧RTX PRO6000，新卡尚未重测模块占比。首轮profile沿用四段固定输入，每段25帧，预热一次、正式重复两次，不改权重和精度。分阶段同步是为了归因，因此这些阶段耗时不能替换模型计算成本表的正式测速结果。每段约12.626秒模型段中，RGB VAE编码约2.739秒，CoC VAE编码约2.516秒，重叠拼接与时序VAE解码约4.975秒，三项合计约81%；UNet约2.258秒。</w:t>
-      </w:r>
-    </w:p>
-    <w:p>
-      <w:pPr>
-        <w:spacing w:line="324" w:lineRule="auto" w:after="200"/>
-      </w:pPr>
-      <w:r>
-        <w:rPr>
-          <w:rFonts w:ascii="微软雅黑" w:hAnsi="微软雅黑"/>
-          <w:sz w:val="24"/>
-        </w:rPr>
-        <w:t>RGB和CoC编码阶段的Torch allocated峰值都约34.29 GiB；重叠拼接与解码阶段约29.65 GiB，UNet约14.39 GiB。这些是含常驻权重和缓存的绝对峰值，不能相加，也不能与旧卡模型计算成本表约38.47 GiB的设备占用采样值混为同一口径。持续RGB特征缓存约6.47 GiB，其中最高分辨率一级占4.5 GiB。</w:t>
-      </w:r>
-    </w:p>
-    <w:p>
-      <w:pPr>
-        <w:spacing w:line="324" w:lineRule="auto" w:after="200"/>
-      </w:pPr>
-      <w:r>
-        <w:rPr>
-          <w:rFonts w:ascii="微软雅黑" w:hAnsi="微软雅黑"/>
-          <w:sz w:val="24"/>
-        </w:rPr>
-        <w:t>每25个最终输出帧，RGB和CoC分别处理48个编码帧槽，解码处理32个帧槽，包含窗口重叠和padding。但是重复数量不等于可以无损删掉的计算，因为还涉及随机采样、缓存索引和时序解码上下文。目前只定位了成本来源，没有验证任何优化已经提速、降显存或保持质量。模型计算成本和完整视频流水分别评价；低帧率深度专项继续暂停。</w:t>
-      </w:r>
-    </w:p>
-    <w:p>
-      <w:r>
-        <w:br w:type="page"/>
+        <w:t>07  ATB用时集中在编码与解码（RTX 4090 D模块分析）</w:t>
+      </w:r>
+    </w:p>
+    <w:p>
+      <w:pPr>
+        <w:spacing w:line="324" w:lineRule="auto" w:after="200"/>
+      </w:pPr>
+      <w:r>
+        <w:rPr>
+          <w:rFonts w:ascii="微软雅黑" w:hAnsi="微软雅黑"/>
+          <w:sz w:val="24"/>
+        </w:rPr>
+        <w:t>这一页说明Any-to-Bokeh的时间花在哪里，数据来自4090 D上的模块级归因。四个固定片段、每段25帧、原生8/8/9窗口调用，预热一次、正式重复两次。分阶段耗时带同步插桩，同步本身有一点额外开销，所以这些数字用来比较各阶段的相对占比，不替换模型计算成本表里的正式计时。正式未插桩Core是20.1128秒，带插桩20.1707秒，相差约0.29%。</w:t>
+      </w:r>
+    </w:p>
+    <w:p>
+      <w:pPr>
+        <w:spacing w:line="324" w:lineRule="auto" w:after="200"/>
+      </w:pPr>
+      <w:r>
+        <w:rPr>
+          <w:rFonts w:ascii="微软雅黑" w:hAnsi="微软雅黑"/>
+          <w:sz w:val="24"/>
+        </w:rPr>
+        <w:t>从表里看三件事。第一，VAE相关的三行——RGB编码、CoC编码、重叠拼接与时序解码——合计16.209秒，占80.36%，与旧卡测到的81.01%基本一致，说明瓶颈构成没有因为换卡而改变。第二，单段占比最大的是重叠拼接与时序解码，7.841秒占38.87%，但这一段包含拼接和四次解码调用，不能把整段耗时都归给解码器。第三，UNet只占18.55%，说明这条流水线的成本主要不在生成主干的采样上，而在VAE的编码和解码两端。</w:t>
+      </w:r>
+    </w:p>
+    <w:p>
+      <w:pPr>
+        <w:spacing w:line="324" w:lineRule="auto" w:after="200"/>
+      </w:pPr>
+      <w:r>
+        <w:rPr>
+          <w:rFonts w:ascii="微软雅黑" w:hAnsi="微软雅黑"/>
+          <w:sz w:val="24"/>
+        </w:rPr>
+        <w:t>显存那一列按绝对峰值理解：34.29 GiB出现在RGB和CoC编码阶段，29.65 GiB出现在重叠拼接与解码阶段，14.39 GiB是UNet。这些数字都包含常驻权重和缓存，彼此不能相加，也不能和模型计算成本表的设备采样峰值直接比较，因为那张表用的是设备采样口径。</w:t>
+      </w:r>
+    </w:p>
+    <w:p>
+      <w:pPr>
+        <w:spacing w:line="324" w:lineRule="auto" w:after="200"/>
+      </w:pPr>
+      <w:r>
+        <w:rPr>
+          <w:rFonts w:ascii="微软雅黑" w:hAnsi="微软雅黑"/>
+          <w:sz w:val="24"/>
+        </w:rPr>
+        <w:t>页脚两行补充两点：这里的时间是归因口径，正式值仍以未插桩测量为准；旧卡同口径占比81.01%，各阶段在新卡上约为旧卡的1.6倍，两卡分开记录，不计算跨卡加速倍数。</w:t>
+      </w:r>
+    </w:p>
+    <w:p>
+      <w:pPr>
+        <w:spacing w:line="324" w:lineRule="auto" w:after="200"/>
+      </w:pPr>
+      <w:r>
+        <w:rPr>
+          <w:rFonts w:ascii="微软雅黑" w:hAnsi="微软雅黑"/>
+          <w:sz w:val="24"/>
+        </w:rPr>
+        <w:t>这一页先看显存是怎么构成的，再看一个新的优化实验。</w:t>
+      </w:r>
+    </w:p>
+    <w:p>
+      <w:pPr>
+        <w:spacing w:line="324" w:lineRule="auto" w:after="200"/>
+      </w:pPr>
+      <w:r>
+        <w:rPr>
+          <w:rFonts w:ascii="微软雅黑" w:hAnsi="微软雅黑"/>
+          <w:sz w:val="24"/>
+        </w:rPr>
+        <w:t>第一张表是显存和用时的前后对照。原版是当前基线实现，候选版本只改了一处：VAE编码器里残差返回时，如果缩放系数严格等于1，就跳过这一步除法。能跳过的原因是除以1本身不改变数值，但原来的写法会产生一个和特征图同样大的临时张量，全分辨率那一层就是4.5 GiB。加上这类临时张量，编码阶段的峰值需要同时容纳五笔4.5 GiB的分配，也就是22.5 GiB。</w:t>
+      </w:r>
+    </w:p>
+    <w:p>
+      <w:pPr>
+        <w:spacing w:line="324" w:lineRule="auto" w:after="200"/>
+      </w:pPr>
+      <w:r>
+        <w:rPr>
+          <w:rFonts w:ascii="微软雅黑" w:hAnsi="微软雅黑"/>
+          <w:sz w:val="24"/>
+        </w:rPr>
+        <w:t>改成跳过后，编码阶段只需四笔并发分配，完整运行的allocated峰值从34.294 GiB降到29.797 GiB，减少4.497 GiB，约13.11%；reserved和设备采样峰值也同步下降约4.5 GiB。时间上四片段等权平均从20.273秒降到20.049秒，降低1.10%；四个片段的差值都超过两组各自标准差的两倍，所以这个收益在本轮测量中是稳定的。</w:t>
+      </w:r>
+    </w:p>
+    <w:p>
+      <w:pPr>
+        <w:spacing w:line="324" w:lineRule="auto" w:after="200"/>
+      </w:pPr>
+      <w:r>
+        <w:rPr>
+          <w:rFonts w:ascii="微软雅黑" w:hAnsi="微软雅黑"/>
+          <w:sz w:val="24"/>
+        </w:rPr>
+        <w:t>正确性方面，四个片段的输出与预热做了严格对比：浮点输出的不同元素数、不同位模式数，以及转成8位RGB后的不同字节数，全部为零；采样调用次数与顺序、随机状态、四级RGB缓存和latent cache也都逐字节一致。也就是说，这个改动在已测输入上没有改变结果。</w:t>
+      </w:r>
+    </w:p>
+    <w:p>
+      <w:pPr>
+        <w:spacing w:line="324" w:lineRule="auto" w:after="200"/>
+      </w:pPr>
+      <w:r>
+        <w:rPr>
+          <w:rFonts w:ascii="微软雅黑" w:hAnsi="微软雅黑"/>
+          <w:sz w:val="24"/>
+        </w:rPr>
+        <w:t>第二张表是显存构成。最值得记住的是四级RGB特征缓存，合计6.469 GiB，它从RGB编码一直保留到解码结束，跨CoC、UNet和解码三个环节；latent cache的逻辑大小很小，但底层仍保留16个帧槽的存储；编码阶段的并发大分配就是刚才说的五笔4.5 GiB。</w:t>
+      </w:r>
+    </w:p>
+    <w:p>
+      <w:pPr>
+        <w:spacing w:line="324" w:lineRule="auto" w:after="200"/>
+      </w:pPr>
+      <w:r>
+        <w:rPr>
+          <w:rFonts w:ascii="微软雅黑" w:hAnsi="微软雅黑"/>
+          <w:sz w:val="24"/>
+        </w:rPr>
+        <w:t>表下还有一句正确性说明：四个片段的输出逐位和8位结果都没有差异，但设备采样峰值仍高于32 GiB，所以还没有在32GB显卡上实测，不能宣称可以在32GB卡上运行。</w:t>
+      </w:r>
+    </w:p>
+    <w:p>
+      <w:pPr>
+        <w:spacing w:line="324" w:lineRule="auto" w:after="200"/>
+      </w:pPr>
+      <w:r>
+        <w:rPr>
+          <w:rFonts w:ascii="微软雅黑" w:hAnsi="微软雅黑"/>
+          <w:sz w:val="24"/>
+        </w:rPr>
+        <w:t>最后强调这次改动的定位。它是Any-to-Bokeh自身的实现效率优化，不是我们方法的创新点，也不直接算研究贡献。原正式效率表和原生基线都不替换，候选版本用显式开关单独保留；原计划的编码微批量方案先搁置。</w:t>
       </w:r>
     </w:p>
     <w:p>

</xml_diff>

<commit_message>
report: relabel ATB column and drop slide footnotes
Rename 占插桩Core to 时间占比 and keep only the one-line takeaway on
slides 07/08; the wording moved into the speech draft.

Co-Authored-By: Claude Opus 5.5 (1M context) <noreply@anthropic.com>
</commit_message>
<xml_diff>
--- a/汇报/下次汇报草稿_基线更新与ATB分析/基线更新与ATB效率分析_讲稿草稿.docx
+++ b/汇报/下次汇报草稿_基线更新与ATB分析/基线更新与ATB效率分析_讲稿草稿.docx
@@ -434,7 +434,19 @@
           <w:rFonts w:ascii="微软雅黑" w:hAnsi="微软雅黑"/>
           <w:sz w:val="24"/>
         </w:rPr>
-        <w:t>页脚两行补充两点：这里的时间是归因口径，正式值仍以未插桩测量为准；旧卡同口径占比81.01%，各阶段在新卡上约为旧卡的1.6倍，两卡分开记录，不计算跨卡加速倍数。</w:t>
+        <w:t>时间占比那一列的分母是带插桩的完整Core，也就是20.171秒。写成"占插桩Core"容易让人以为是正式测量值，所以PPT上就标成"时间占比"，这里说明一下它的分母是什么。</w:t>
+      </w:r>
+    </w:p>
+    <w:p>
+      <w:pPr>
+        <w:spacing w:line="324" w:lineRule="auto" w:after="200"/>
+      </w:pPr>
+      <w:r>
+        <w:rPr>
+          <w:rFonts w:ascii="微软雅黑" w:hAnsi="微软雅黑"/>
+          <w:sz w:val="24"/>
+        </w:rPr>
+        <w:t>还有两点补充。第一，这里的时间是归因口径，正式效率仍以未插桩测量20.1128秒为准。第二，旧卡的同口径占比是81.01%，各阶段在新卡上约为旧卡的1.6倍，两卡分开记录，不计算跨卡加速倍数。</w:t>
       </w:r>
     </w:p>
     <w:p>
@@ -506,7 +518,7 @@
           <w:rFonts w:ascii="微软雅黑" w:hAnsi="微软雅黑"/>
           <w:sz w:val="24"/>
         </w:rPr>
-        <w:t>表下还有一句正确性说明：四个片段的输出逐位和8位结果都没有差异，但设备采样峰值仍高于32 GiB，所以还没有在32GB显卡上实测，不能宣称可以在32GB卡上运行。</w:t>
+        <w:t>正确性方面再补一句：四个片段的输出逐位和8位结果都没有差异，但设备采样峰值仍高于32 GiB，所以还没有在32GB显卡上实测，不能宣称可以在32GB卡上运行。</w:t>
       </w:r>
     </w:p>
     <w:p>

</xml_diff>